<commit_message>
Module 1: rebuild Rook company docs — no agencies, seven-person roster, seams relocated
</commit_message>
<xml_diff>
--- a/00-rook/company/glossary.docx
+++ b/00-rook/company/glossary.docx
@@ -46,7 +46,7 @@
           <w:sz w:val="22"/>
           <w:szCs w:val="22"/>
         </w:rPr>
-        <w:t xml:space="preserve">If you are new here, read this before your first agency call. Several of these words mean something specific at Rook and something looser everywhere else.</w:t>
+        <w:t xml:space="preserve">If you are new here, read this before your first call with a responder or handler. Several of these words mean something specific at Rook and something looser everywhere else.</w:t>
       </w:r>
     </w:p>
     <w:p>
@@ -61,30 +61,7 @@
           <w:sz w:val="24"/>
           <w:szCs w:val="24"/>
         </w:rPr>
-        <w:t xml:space="preserve">The people and organizations</w:t>
-      </w:r>
-    </w:p>
-    <w:p>
-      <w:pPr>
-        <w:spacing w:after="150"/>
-      </w:pPr>
-      <w:r>
-        <w:rPr>
-          <w:rFonts w:ascii="Calibri" w:cs="Calibri" w:eastAsia="Calibri" w:hAnsi="Calibri"/>
-          <w:b/>
-          <w:bCs/>
-          <w:sz w:val="22"/>
-          <w:szCs w:val="22"/>
-        </w:rPr>
-        <w:t xml:space="preserve">Agency</w:t>
-      </w:r>
-      <w:r>
-        <w:rPr>
-          <w:rFonts w:ascii="Calibri" w:cs="Calibri" w:eastAsia="Calibri" w:hAnsi="Calibri"/>
-          <w:sz w:val="22"/>
-          <w:szCs w:val="22"/>
-        </w:rPr>
-        <w:t xml:space="preserve">  —  An organization that coordinates a roster of responders and pays us for the software. Our contractual counterparty. Agencies vary from four-person municipal outfits to Meridian, which runs several hundred responders across eleven regions.</w:t>
+        <w:t xml:space="preserve">The people</w:t>
       </w:r>
     </w:p>
     <w:p>
@@ -107,7 +84,7 @@
           <w:sz w:val="22"/>
           <w:szCs w:val="22"/>
         </w:rPr>
-        <w:t xml:space="preserve">  —  An individual who accepts callouts and goes to incidents. Not a Rook employee, not an agency employee in most cases — typically contracted or affiliated. Appears in our systems as a record with capability tags and availability, never as a legal identity.</w:t>
+        <w:t xml:space="preserve">  —  An individual who accepts callouts and goes to incidents. Not a Rook employee — independently operating. Appears in our systems as a record with capability tags and availability, never as a legal identity.</w:t>
       </w:r>
     </w:p>
     <w:p>
@@ -130,7 +107,7 @@
           <w:sz w:val="22"/>
           <w:szCs w:val="22"/>
         </w:rPr>
-        <w:t xml:space="preserve">  —  The agency-side person responsible for a specific responder or small group of them — their availability, their gear, their readiness. The handler is usually who is actually clicking around in our product.</w:t>
+        <w:t xml:space="preserve">  —  The person responsible for a specific responder or small group of them — their availability, their gear, their readiness. The handler is usually who is actually clicking around in our product.</w:t>
       </w:r>
     </w:p>
     <w:p>
@@ -153,7 +130,7 @@
           <w:sz w:val="22"/>
           <w:szCs w:val="22"/>
         </w:rPr>
-        <w:t xml:space="preserve">  —  Agency-side owner of equipment stock and the approvals on it. A Supply user, rarely a Dispatch one.</w:t>
+        <w:t xml:space="preserve">  —  Owner of equipment stock and the approvals on it. A Supply user, rarely a Dispatch one.</w:t>
       </w:r>
     </w:p>
     <w:p>
@@ -260,7 +237,7 @@
           <w:sz w:val="22"/>
           <w:szCs w:val="22"/>
         </w:rPr>
-        <w:t xml:space="preserve">  —  How long an offer stays live before it expires and moves to the next responder. Set in the release, not per agency.</w:t>
+        <w:t xml:space="preserve">  —  How long an offer stays live before it expires and moves to the next responder. Set in the release, the same for everyone.</w:t>
       </w:r>
     </w:p>
     <w:p>
@@ -459,7 +436,7 @@
           <w:sz w:val="22"/>
           <w:szCs w:val="22"/>
         </w:rPr>
-        <w:t xml:space="preserve">  —  One agency's responders taking callouts from another agency. Not supported today; on the Q4 exploration list.</w:t>
+        <w:t xml:space="preserve">  —  Responders in different regions covering callouts for each other when the primary is unavailable. Not supported today; on the Q4 exploration list.</w:t>
       </w:r>
     </w:p>
     <w:p>
@@ -497,7 +474,7 @@
           <w:sz w:val="22"/>
           <w:szCs w:val="22"/>
         </w:rPr>
-        <w:t xml:space="preserve">  —  A handler's request for equipment, routed through the agency's own approval rules.</w:t>
+        <w:t xml:space="preserve">  —  A handler's request for equipment, routed to a quartermaster for approval.</w:t>
       </w:r>
     </w:p>
     <w:p>

</xml_diff>